<commit_message>
CL3 AT3 + plan: propagate the Multi-AZ database limitation
Reliability demonstration is now an application-tier failover (the ASG recovers
across AZs) plus a database backup/restore + cross-Region DR drill — the database is
single-instance, so there is no DB failover to demonstrate.

- AT3 assessor + student: E3 / task / tips reframed; regenerated both .docx
- assessment_plan: header reliability bullet + proving-run line reworded; changelog v9.
  Coverage unchanged (same PC/PE/KE mappings).

Co-Authored-By: Claude Opus 4.8 (1M context) <noreply@anthropic.com>
</commit_message>
<xml_diff>
--- a/S1-CL3-Cloud-Infrastructure-Improvement/assessments/AT3/AT3-Implement-Assessor.docx
+++ b/S1-CL3-Cloud-Infrastructure-Improvement/assessments/AT3/AT3-Implement-Assessor.docx
@@ -473,7 +473,7 @@
               <w:pStyle w:val="Assessortext"/>
             </w:pPr>
             <w:r>
-              <w:t>• Monitoring and measuring the deployed architecture against the performance metrics and business goals; testing and demonstrating security, reliability, scalability and cost optimisation on the whole deployed system (including a failover demonstration and a scale-out demonstration).</w:t>
+              <w:t>• Monitoring and measuring the deployed architecture against the performance metrics and business goals; testing and demonstrating security, reliability, scalability and cost optimisation on the whole deployed system (including, for reliability, an application-tier failover demonstration and a database backup/restore and DR demonstration, and a scale-out demonstration for scalability).</w:t>
             </w:r>
           </w:p>
           <w:p>
@@ -1085,7 +1085,7 @@
           </w:tcPr>
           <w:p>
             <w:r>
-              <w:t>E3 — Test and demonstrate: tests and demonstrates security, reliability, scalability and cost optimisation on the deployed resources — including a reliability (failover) demonstration and a scalability (scale-out) demonstration on the whole system.</w:t>
+              <w:t>E3 — Test and demonstrate: tests and demonstrates security, reliability, scalability and cost optimisation on the deployed resources — for reliability, an application-tier failover demonstration (terminate an instance; the Auto Scaling group recovers across AZs) and a database backup/restore and cross-Region DR demonstration (the database is single-instance — no Multi-AZ failover); and a scalability (scale-out) demonstration on the whole system.</w:t>
             </w:r>
           </w:p>
         </w:tc>
@@ -1369,7 +1369,7 @@
         <w:pStyle w:val="Assessortext"/>
       </w:pPr>
       <w:r>
-        <w:t>• Tested and demonstrated all four optimisation concerns on the whole system — security, reliability (a failover demonstration), scalability (a scale-out demonstration), and cost optimisation.</w:t>
+        <w:t>• Tested and demonstrated all four optimisation concerns on the whole system — security, reliability (an application-tier failover demonstration plus a database backup/restore and DR demonstration), scalability (a scale-out demonstration), and cost optimisation.</w:t>
       </w:r>
     </w:p>
     <w:p>
@@ -1417,7 +1417,7 @@
         <w:pStyle w:val="Assessortext"/>
       </w:pPr>
       <w:r>
-        <w:t>Demonstrate, don't just describe. Reliability and scalability need to be shown — trigger a failover and a scale-out and capture the evidence.</w:t>
+        <w:t>Demonstrate, don't just describe. Reliability and scalability need to be shown — trigger an application-tier failover (terminate an instance and watch the ASG recover across AZs), run a database restore / DR drill, and trigger a scale-out, capturing the evidence for each.</w:t>
       </w:r>
     </w:p>
     <w:p>

</xml_diff>

<commit_message>
fix: AT3 assessor names the fallback path (generator); SE-16 closed
The AT3 assessor reference fallback artefact already existed (lab-pack
improved.yaml -- doubles as the AT2 model answer + AT3 assessor reference,
proven live 2026-06-21); SE-16 had pointed at the wrong artefact. Re-point it.
The one genuine fix: the AT3 assessor generator now lists the fallback as an
optional supplied resource (if a team's AT2 implementation is not appropriate
to deploy in AT3, the assessor may supply improved.yaml so the individual is
assessed on their own AT3 work) -- instrument regenerated, AT3 traceability
PASS. SR-CL3-07 unchanged; consolidated still in sync. Closes the last of the
four Gate 7->8 gaps.

Co-Authored-By: Claude Opus 4.8 (1M context) <noreply@anthropic.com>
</commit_message>
<xml_diff>
--- a/S1-CL3-Cloud-Infrastructure-Improvement/assessments/AT3/AT3-Implement-Assessor.docx
+++ b/S1-CL3-Cloud-Infrastructure-Improvement/assessments/AT3/AT3-Implement-Assessor.docx
@@ -694,6 +694,14 @@
             </w:pPr>
             <w:r>
               <w:t>• The approved improvement design and the team's validated implementation (the CloudFormation change-set applied to the baseline).</w:t>
+            </w:r>
+          </w:p>
+          <w:p>
+            <w:pPr>
+              <w:pStyle w:val="Assessortext"/>
+            </w:pPr>
+            <w:r>
+              <w:t>• Assessor reference combined template (the lab-pack improved.yaml) — an optional fallback the assessor may supply if a student's AT2 team implementation is not appropriate to deploy in AT3, so the individual can deploy and be assessed on their own AT3 work rather than be blocked by the team's result.</w:t>
             </w:r>
           </w:p>
           <w:p>

</xml_diff>